<commit_message>
chore(fb-595.54.72): refresh generated engine outputs
</commit_message>
<xml_diff>
--- a/courts/tenth-circuit/utah/state/court-of-appeals/answering-brief/usage/OUTPUT-answering-brief.docx
+++ b/courts/tenth-circuit/utah/state/court-of-appeals/answering-brief/usage/OUTPUT-answering-brief.docx
@@ -4905,7 +4905,7 @@
         <w:tab/>
       </w:r>
       <w:r>
-        <w:t xml:space="preserve">22, 49</w:t>
+        <w:t xml:space="preserve">23, 49</w:t>
       </w:r>
     </w:p>
     <w:p>
@@ -5800,7 +5800,7 @@
           <w:tab w:val="right" w:leader="dot" w:pos="9360"/>
         </w:tabs>
         <w:spacing w:before="196" w:after="0" w:line="322" w:lineRule="exact"/>
-        <w:ind w:left="360" w:right="1960" w:hanging="360"/>
+        <w:ind w:left="360" w:right="2380" w:hanging="360"/>
       </w:pPr>
       <w:r>
         <w:rPr>
@@ -5889,7 +5889,7 @@
         <w:tab/>
       </w:r>
       <w:r>
-        <w:t xml:space="preserve">11, 17, 21, 22, 49</w:t>
+        <w:t xml:space="preserve">11, 17, 21, 22, 23, 49</w:t>
       </w:r>
     </w:p>
     <w:p>
@@ -20707,6 +20707,7 @@
     <w:unhideWhenUsed/>
     <w:qFormat/>
     <w:pPr>
+      <w:keepLines/>
       <w:spacing w:before="0" w:after="140" w:line="322" w:lineRule="exact"/>
     </w:pPr>
     <w:rPr>

</xml_diff>

<commit_message>
court(utahctapp): answering brief latex gated, P.3d placeholders escaped as filed, docx reported (fb-595.54.72)
Co-Authored-By: Claude Opus 5.5 <noreply@anthropic.com>
</commit_message>
<xml_diff>
--- a/courts/tenth-circuit/utah/state/court-of-appeals/answering-brief/usage/OUTPUT-answering-brief.docx
+++ b/courts/tenth-circuit/utah/state/court-of-appeals/answering-brief/usage/OUTPUT-answering-brief.docx
@@ -4785,7 +4785,7 @@
         <w:t xml:space="preserve"> </w:t>
       </w:r>
       <w:r>
-        <w:t xml:space="preserve">—</w:t>
+        <w:t xml:space="preserve">---</w:t>
       </w:r>
       <w:r>
         <w:t xml:space="preserve"> </w:t>
@@ -4797,7 +4797,7 @@
         <w:t xml:space="preserve"> </w:t>
       </w:r>
       <w:r>
-        <w:t xml:space="preserve">––</w:t>
+        <w:t xml:space="preserve">----</w:t>
       </w:r>
       <w:r>
         <w:t xml:space="preserve">   </w:t>
@@ -5769,7 +5769,7 @@
         <w:t xml:space="preserve"> </w:t>
       </w:r>
       <w:r>
-        <w:t xml:space="preserve">—</w:t>
+        <w:t xml:space="preserve">---</w:t>
       </w:r>
       <w:r>
         <w:t xml:space="preserve"> </w:t>
@@ -5781,7 +5781,7 @@
         <w:t xml:space="preserve"> </w:t>
       </w:r>
       <w:r>
-        <w:t xml:space="preserve">––</w:t>
+        <w:t xml:space="preserve">----</w:t>
       </w:r>
       <w:r>
         <w:t xml:space="preserve">   </w:t>
@@ -5967,7 +5967,7 @@
         <w:t xml:space="preserve"> </w:t>
       </w:r>
       <w:r>
-        <w:t xml:space="preserve">—</w:t>
+        <w:t xml:space="preserve">---</w:t>
       </w:r>
       <w:r>
         <w:t xml:space="preserve"> </w:t>
@@ -5979,7 +5979,7 @@
         <w:t xml:space="preserve"> </w:t>
       </w:r>
       <w:r>
-        <w:t xml:space="preserve">––</w:t>
+        <w:t xml:space="preserve">----</w:t>
       </w:r>
       <w:r>
         <w:t xml:space="preserve">   </w:t>
@@ -8376,7 +8376,7 @@
         <w:t xml:space="preserve"> </w:t>
       </w:r>
       <w:r>
-        <w:t xml:space="preserve">—</w:t>
+        <w:t xml:space="preserve">---</w:t>
       </w:r>
       <w:r>
         <w:t xml:space="preserve"> </w:t>
@@ -8388,7 +8388,7 @@
         <w:t xml:space="preserve"> </w:t>
       </w:r>
       <w:r>
-        <w:t xml:space="preserve">––</w:t>
+        <w:t xml:space="preserve">----</w:t>
       </w:r>
       <w:r>
         <w:t xml:space="preserve">   </w:t>
@@ -9461,7 +9461,7 @@
         <w:t xml:space="preserve">State v. Bunker</w:t>
       </w:r>
       <w:r>
-        <w:t xml:space="preserve">, 2019 UT App 118, ¶8, — P.3d —-.</w:t>
+        <w:t xml:space="preserve">, 2019 UT App 118, ¶8, --- P.3d ----.</w:t>
       </w:r>
     </w:p>
     <w:p>
@@ -11738,7 +11738,7 @@
         <w:pStyle w:val="BodyText"/>
       </w:pPr>
       <w:r>
-        <w:t xml:space="preserve">And Harper’s withdrawal counsel phrased the argument in terms of Harper thinking he was guaranteed probation—not in terms of a promised recommendation that the sentencing court had discretion to disregard. See R938:631 (acknowledging that “we understand” that the court had discretion in sentencing but arguing that “the problem is … that he was informed by his attorney … that he would get probation if he pled” (emphasis added)); R938:632 (“[T]he State is agreeing that he will receive probation.” (emphasis added)); R938:632 (“And he was relying on his attorney’s representation that he will be given probation.” (emphasis added)); R938:632 “[Y]ou wouldn’t put down a two-step reduction if he complies with probation if there wasn’t certainly an inference it was expected that he would get probation.” (emphasis added)); R938:632 (“[W]hat was in his mind at the time … was the representation by this attorney that in exchange for pleading … you will get probation … .” (emphasis added)); R938:639 (“[H]e was entering a plea based on the statement that he would get probation.” (emphasis added)).</w:t>
+        <w:t xml:space="preserve">And Harper’s withdrawal counsel phrased the argument in terms of Harper thinking he was guaranteed probation—not in terms of a promised recommendation that the sentencing court had discretion to disregard. See R938:631 (acknowledging that “we understand” that the court had discretion in sentencing but arguing that “the problem is … that he was informed by his attorney … that he would get probation if he pled” (emphasis added)); R938:632 (“[T]he State is agreeing that he will receive probation.” (emphasis added)); R938:632 (“And he was relying on his attorney’s representation that he will be given probation.” (emphasis added)); R938:632 “[Y]ou wouldn’t put down a two-step reduction if he complies with probation if there wasn’t certainly an inference it was expected that he would get probation.” (emphasis added)); R938:632 (“[W]hat was in his mind at the time … was the representation by this attorney that in exchange for pleading … you will get probation … .” (emphasis added)); R938:639 (“[H]e was entering a plea based on the statement that he would get probation.” (emphasis added)).</w:t>
       </w:r>
     </w:p>
     <w:p>
@@ -13384,7 +13384,7 @@
         <w:t xml:space="preserve">accord State v. Archuleta</w:t>
       </w:r>
       <w:r>
-        <w:t xml:space="preserve">, 2019 UT App 136, ¶20, — P.3d —-. If Harper means an agreement to not oppose Harper’s request for probation, the analysis in this case would functionally be no different than if dealing with an agreement to affirmatively recommend probation.</w:t>
+        <w:t xml:space="preserve">, 2019 UT App 136, ¶20, --- P.3d ----. If Harper means an agreement to not oppose Harper’s request for probation, the analysis in this case would functionally be no different than if dealing with an agreement to affirmatively recommend probation.</w:t>
       </w:r>
     </w:p>
     <w:p>
@@ -13432,7 +13432,7 @@
         <w:t xml:space="preserve">Brady v. Park</w:t>
       </w:r>
       <w:r>
-        <w:t xml:space="preserve">, 2019 UT 16, ¶54, — P.3d —-. “[W]here a contractual term or provision is ambiguous as to what the parties intended, the question becomes a question of fact to be determined by the fact-finder” “by considering extrinsic evidence of the parties’ intent.”</w:t>
+        <w:t xml:space="preserve">, 2019 UT 16, ¶54, --- P.3d ----. “[W]here a contractual term or provision is ambiguous as to what the parties intended, the question becomes a question of fact to be determined by the fact-finder” “by considering extrinsic evidence of the parties’ intent.”</w:t>
       </w:r>
       <w:r>
         <w:t xml:space="preserve"> </w:t>
@@ -13593,7 +13593,7 @@
         <w:t xml:space="preserve">see also State v. Archuleta</w:t>
       </w:r>
       <w:r>
-        <w:t xml:space="preserve">, 2019 UT App 136, ¶23, — P.3d —- (concluding that defendant failed to meet his burden when he presented no “‘objective evidence’”—only “‘self-serving statements’” that were contradicted by his statements during plea colloquy);</w:t>
+        <w:t xml:space="preserve">, 2019 UT App 136, ¶23, --- P.3d ---- (concluding that defendant failed to meet his burden when he presented no “‘objective evidence’”—only “‘self-serving statements’” that were contradicted by his statements during plea colloquy);</w:t>
       </w:r>
       <w:r>
         <w:t xml:space="preserve"> </w:t>
@@ -17280,7 +17280,7 @@
         <w:t xml:space="preserve"> </w:t>
       </w:r>
       <w:r>
-        <w:t xml:space="preserve">test … .”</w:t>
+        <w:t xml:space="preserve">test … .”</w:t>
       </w:r>
       <w:r>
         <w:t xml:space="preserve"> </w:t>
@@ -17396,7 +17396,7 @@
         <w:t xml:space="preserve">State v. Vallejo</w:t>
       </w:r>
       <w:r>
-        <w:t xml:space="preserve">, 2019 UT 38, ¶¶69–70 &amp; n.13, — P.3d —- (addressing whether counsel’s performance was reasonable without addressing whether objection would have succeeded). Harper has done nothing to meet that standard.</w:t>
+        <w:t xml:space="preserve">, 2019 UT 38, ¶¶69–70 &amp; n.13, --- P.3d ---- (addressing whether counsel’s performance was reasonable without addressing whether objection would have succeeded). Harper has done nothing to meet that standard.</w:t>
       </w:r>
     </w:p>
     <w:p>
@@ -18458,7 +18458,7 @@
         <w:t xml:space="preserve">[</w:t>
       </w:r>
       <w:r>
-        <w:t xml:space="preserve"> </w:t>
+        <w:t xml:space="preserve"> </w:t>
       </w:r>
       <w:r>
         <w:t xml:space="preserve">]</w:t>
@@ -18482,7 +18482,7 @@
         <w:t xml:space="preserve">[</w:t>
       </w:r>
       <w:r>
-        <w:t xml:space="preserve"> </w:t>
+        <w:t xml:space="preserve"> </w:t>
       </w:r>
       <w:r>
         <w:t xml:space="preserve">]</w:t>
@@ -18906,7 +18906,7 @@
         <w:t xml:space="preserve">[</w:t>
       </w:r>
       <w:r>
-        <w:t xml:space="preserve"> </w:t>
+        <w:t xml:space="preserve"> </w:t>
       </w:r>
       <w:r>
         <w:t xml:space="preserve">]</w:t>
@@ -19008,7 +19008,7 @@
         <w:t xml:space="preserve">[</w:t>
       </w:r>
       <w:r>
-        <w:t xml:space="preserve"> </w:t>
+        <w:t xml:space="preserve"> </w:t>
       </w:r>
       <w:r>
         <w:t xml:space="preserve">]</w:t>
@@ -20960,6 +20960,33 @@
       <w:ind w:left="2160" w:hanging="720"/>
     </w:pPr>
   </w:style>
+  <w:style w:type="paragraph" w:customStyle="1" w:styleId="XdQuoteList1">
+    <w:name w:val="Xd Quote List 1"/>
+    <w:basedOn w:val="Normal"/>
+    <w:qFormat/>
+    <w:pPr>
+      <w:spacing w:before="0" w:after="0" w:line="322" w:lineRule="exact"/>
+      <w:ind w:left="1440" w:right="720" w:hanging="720"/>
+    </w:pPr>
+  </w:style>
+  <w:style w:type="paragraph" w:customStyle="1" w:styleId="XdQuoteList2">
+    <w:name w:val="Xd Quote List 2"/>
+    <w:basedOn w:val="Normal"/>
+    <w:qFormat/>
+    <w:pPr>
+      <w:spacing w:before="0" w:after="0" w:line="322" w:lineRule="exact"/>
+      <w:ind w:left="2160" w:right="720" w:hanging="720"/>
+    </w:pPr>
+  </w:style>
+  <w:style w:type="paragraph" w:customStyle="1" w:styleId="XdQuoteList3">
+    <w:name w:val="Xd Quote List 3"/>
+    <w:basedOn w:val="Normal"/>
+    <w:qFormat/>
+    <w:pPr>
+      <w:spacing w:before="0" w:after="0" w:line="322" w:lineRule="exact"/>
+      <w:ind w:left="2880" w:right="720" w:hanging="720"/>
+    </w:pPr>
+  </w:style>
   <w:style w:type="paragraph" w:customStyle="1" w:styleId="XdList1">
     <w:name w:val="XdList1"/>
     <w:basedOn w:val="BodyText"/>

</xml_diff>

<commit_message>
chore(eval): re-render on the merged model the folders that changed on master since serial lane 2 branched, part 05 (fb-595.54.82)
</commit_message>
<xml_diff>
--- a/courts/tenth-circuit/utah/state/court-of-appeals/answering-brief/usage/OUTPUT-answering-brief.docx
+++ b/courts/tenth-circuit/utah/state/court-of-appeals/answering-brief/usage/OUTPUT-answering-brief.docx
@@ -4785,7 +4785,7 @@
         <w:t xml:space="preserve"> </w:t>
       </w:r>
       <w:r>
-        <w:t xml:space="preserve">—</w:t>
+        <w:t xml:space="preserve">---</w:t>
       </w:r>
       <w:r>
         <w:t xml:space="preserve"> </w:t>
@@ -4797,7 +4797,7 @@
         <w:t xml:space="preserve"> </w:t>
       </w:r>
       <w:r>
-        <w:t xml:space="preserve">––</w:t>
+        <w:t xml:space="preserve">----</w:t>
       </w:r>
       <w:r>
         <w:t xml:space="preserve">   </w:t>
@@ -5769,7 +5769,7 @@
         <w:t xml:space="preserve"> </w:t>
       </w:r>
       <w:r>
-        <w:t xml:space="preserve">—</w:t>
+        <w:t xml:space="preserve">---</w:t>
       </w:r>
       <w:r>
         <w:t xml:space="preserve"> </w:t>
@@ -5781,7 +5781,7 @@
         <w:t xml:space="preserve"> </w:t>
       </w:r>
       <w:r>
-        <w:t xml:space="preserve">––</w:t>
+        <w:t xml:space="preserve">----</w:t>
       </w:r>
       <w:r>
         <w:t xml:space="preserve">   </w:t>
@@ -5967,7 +5967,7 @@
         <w:t xml:space="preserve"> </w:t>
       </w:r>
       <w:r>
-        <w:t xml:space="preserve">—</w:t>
+        <w:t xml:space="preserve">---</w:t>
       </w:r>
       <w:r>
         <w:t xml:space="preserve"> </w:t>
@@ -5979,7 +5979,7 @@
         <w:t xml:space="preserve"> </w:t>
       </w:r>
       <w:r>
-        <w:t xml:space="preserve">––</w:t>
+        <w:t xml:space="preserve">----</w:t>
       </w:r>
       <w:r>
         <w:t xml:space="preserve">   </w:t>
@@ -8376,7 +8376,7 @@
         <w:t xml:space="preserve"> </w:t>
       </w:r>
       <w:r>
-        <w:t xml:space="preserve">—</w:t>
+        <w:t xml:space="preserve">---</w:t>
       </w:r>
       <w:r>
         <w:t xml:space="preserve"> </w:t>
@@ -8388,7 +8388,7 @@
         <w:t xml:space="preserve"> </w:t>
       </w:r>
       <w:r>
-        <w:t xml:space="preserve">––</w:t>
+        <w:t xml:space="preserve">----</w:t>
       </w:r>
       <w:r>
         <w:t xml:space="preserve">   </w:t>
@@ -9461,7 +9461,7 @@
         <w:t xml:space="preserve">State v. Bunker</w:t>
       </w:r>
       <w:r>
-        <w:t xml:space="preserve">, 2019 UT App 118, ¶8, — P.3d ––.</w:t>
+        <w:t xml:space="preserve">, 2019 UT App 118, ¶8, --- P.3d ----.</w:t>
       </w:r>
     </w:p>
     <w:p>
@@ -13384,7 +13384,7 @@
         <w:t xml:space="preserve">accord State v. Archuleta</w:t>
       </w:r>
       <w:r>
-        <w:t xml:space="preserve">, 2019 UT App 136, ¶20, — P.3d ––. If Harper means an agreement to not oppose Harper’s request for probation, the analysis in this case would functionally be no different than if dealing with an agreement to affirmatively recommend probation.</w:t>
+        <w:t xml:space="preserve">, 2019 UT App 136, ¶20, --- P.3d ----. If Harper means an agreement to not oppose Harper’s request for probation, the analysis in this case would functionally be no different than if dealing with an agreement to affirmatively recommend probation.</w:t>
       </w:r>
     </w:p>
     <w:p>
@@ -13432,7 +13432,7 @@
         <w:t xml:space="preserve">Brady v. Park</w:t>
       </w:r>
       <w:r>
-        <w:t xml:space="preserve">, 2019 UT 16, ¶54, — P.3d ––. “[W]here a contractual term or provision is ambiguous as to what the parties intended, the question becomes a question of fact to be determined by the fact-finder” “by considering extrinsic evidence of the parties’ intent.”</w:t>
+        <w:t xml:space="preserve">, 2019 UT 16, ¶54, --- P.3d ----. “[W]here a contractual term or provision is ambiguous as to what the parties intended, the question becomes a question of fact to be determined by the fact-finder” “by considering extrinsic evidence of the parties’ intent.”</w:t>
       </w:r>
       <w:r>
         <w:t xml:space="preserve"> </w:t>
@@ -13593,7 +13593,7 @@
         <w:t xml:space="preserve">see also State v. Archuleta</w:t>
       </w:r>
       <w:r>
-        <w:t xml:space="preserve">, 2019 UT App 136, ¶23, — P.3d –– (concluding that defendant failed to meet his burden when he presented no “‘objective evidence’”—only “‘self-serving statements’” that were contradicted by his statements during plea colloquy);</w:t>
+        <w:t xml:space="preserve">, 2019 UT App 136, ¶23, --- P.3d ---- (concluding that defendant failed to meet his burden when he presented no “‘objective evidence’”—only “‘self-serving statements’” that were contradicted by his statements during plea colloquy);</w:t>
       </w:r>
       <w:r>
         <w:t xml:space="preserve"> </w:t>
@@ -17396,7 +17396,7 @@
         <w:t xml:space="preserve">State v. Vallejo</w:t>
       </w:r>
       <w:r>
-        <w:t xml:space="preserve">, 2019 UT 38, ¶¶69–70 &amp; n.13, — P.3d –– (addressing whether counsel’s performance was reasonable without addressing whether objection would have succeeded). Harper has done nothing to meet that standard.</w:t>
+        <w:t xml:space="preserve">, 2019 UT 38, ¶¶69–70 &amp; n.13, --- P.3d ---- (addressing whether counsel’s performance was reasonable without addressing whether objection would have succeeded). Harper has done nothing to meet that standard.</w:t>
       </w:r>
     </w:p>
     <w:p>

</xml_diff>